<commit_message>
Convert to Vancouver numbered citations [1]-[30] in first-appearance order
- Replace all author-year citations with [N] format
- Reorder reference list by first appearance in body text
- Fix docx generator: use explicit numbering for references
  (prevents Word auto-numbering from continuing previous lists)
- Verify: all 30 citations present, no gaps, figures 1-8 sequential

Co-Authored-By: Tatsuki Onishi <bougtoir@gmail.com>
</commit_message>
<xml_diff>
--- a/spectral-causality-brainstorm/06_spectral_causality_academic.docx
+++ b/spectral-causality-brainstorm/06_spectral_causality_academic.docx
@@ -266,7 +266,7 @@
         <w:rPr>
           <w:b w:val="0"/>
         </w:rPr>
-        <w:t xml:space="preserve"> (Pearl, 2009): 介入に基づく反事実的定義</w:t>
+        <w:t xml:space="preserve"> [1]: 介入に基づく反事実的定義</w:t>
       </w:r>
     </w:p>
     <w:p>
@@ -283,7 +283,7 @@
         <w:rPr>
           <w:b w:val="0"/>
         </w:rPr>
-        <w:t xml:space="preserve"> (Rubin, 1974): 処置群と対照群の潜在結果の差</w:t>
+        <w:t xml:space="preserve"> [2]: 処置群と対照群の潜在結果の差</w:t>
       </w:r>
     </w:p>
     <w:p>
@@ -300,7 +300,7 @@
         <w:rPr>
           <w:b w:val="0"/>
         </w:rPr>
-        <w:t xml:space="preserve"> (Shimizu et al., 2006): データの非ガウス性を利用した因果方向の同定</w:t>
+        <w:t xml:space="preserve"> [3]: データの非ガウス性を利用した因果方向の同定</w:t>
       </w:r>
     </w:p>
     <w:p>
@@ -317,7 +317,7 @@
         <w:rPr>
           <w:b w:val="0"/>
         </w:rPr>
-        <w:t xml:space="preserve"> (Granger, 1969): 時系列における予測改善に基づく因果性</w:t>
+        <w:t xml:space="preserve"> [4]: 時系列における予測改善に基づく因果性</w:t>
       </w:r>
     </w:p>
     <w:p>
@@ -539,7 +539,7 @@
           <w:i/>
           <w:sz w:val="18"/>
         </w:rPr>
-        <w:t>図1: DirectLiNGAM (Shimizu et al., 2011) により推定された因果DAG。UCI心疾患データ（Cleveland subset, n=297）の5つの臨床変数に対して適用。上流（原因側）から下流（結果側）へ因果的フローが流れる。青線は正の因果効果、赤線は負の因果効果を示す。LiNGAMはDAG仮定を置くため循環は許容されないが、スペクトル因果性ではHodge分解によりフィードバック（循環成分）も定量化可能である。</w:t>
+        <w:t>図1: DirectLiNGAM [5] により推定された因果DAG。UCI心疾患データ（Cleveland subset, n=297）の5つの臨床変数に対して適用。上流（原因側）から下流（結果側）へ因果的フローが流れる。青線は正の因果効果、赤線は負の因果効果を示す。LiNGAMはDAG仮定を置くため循環は許容されないが、スペクトル因果性ではHodge分解によりフィードバック（循環成分）も定量化可能である。</w:t>
       </w:r>
     </w:p>
     <w:p>
@@ -1579,7 +1579,7 @@
         <w:rPr>
           <w:b w:val="0"/>
         </w:rPr>
-        <w:t>（Graph Signal Processing; GSP）の基礎となっている (Shuman et al., 2013)。</w:t>
+        <w:t>（Graph Signal Processing; GSP）の基礎となっている [6]。</w:t>
       </w:r>
     </w:p>
     <w:p>
@@ -1900,7 +1900,7 @@
         <w:rPr>
           <w:b w:val="0"/>
         </w:rPr>
-        <w:t>（磁気ラプラシアン; de Resende &amp; da Costa, 2020; Zhang et al., 2021）</w:t>
+        <w:t>（磁気ラプラシアン [7, 8]）</w:t>
       </w:r>
     </w:p>
     <w:p>
@@ -5777,7 +5777,7 @@
         <w:rPr>
           <w:b w:val="0"/>
         </w:rPr>
-        <w:t>（グラフ上の Hodge 分解; Jiang et al., 2011）</w:t>
+        <w:t>（グラフ上の Hodge 分解; Jiang et al. [9]）</w:t>
       </w:r>
     </w:p>
     <w:p>
@@ -7216,7 +7216,7 @@
                 <w:b w:val="0"/>
                 <w:sz w:val="18"/>
               </w:rPr>
-              <w:t>理論的保証あり (Shimizu et al., 2006)</w:t>
+              <w:t>理論的保証あり [3]</w:t>
             </w:r>
           </w:p>
         </w:tc>
@@ -7295,7 +7295,7 @@
         <w:rPr>
           <w:b w:val="0"/>
         </w:rPr>
-        <w:t>Granger因果 (Granger, 1969) は時系列データに対して、「</w:t>
+        <w:t>Granger因果 [4] は時系列データに対して、「</w:t>
       </w:r>
       <w:r>
         <w:rPr>
@@ -7428,7 +7428,7 @@
         <w:rPr>
           <w:b w:val="0"/>
         </w:rPr>
-        <w:t>Pearl (2009) が提唱した「因果の梯子（Ladder of Causation）」に照らすと：</w:t>
+        <w:t>Pearl [1] が提唱した「因果の梯子（Ladder of Causation）」に照らすと：</w:t>
       </w:r>
     </w:p>
     <w:tbl>
@@ -7887,7 +7887,7 @@
         <w:rPr>
           <w:b w:val="0"/>
         </w:rPr>
-        <w:t>疫学における因果判断の古典的枠組みである Hill の9基準 (Hill, 1965) に照らすと、スペクトル因果性は従来手法がカバーしていなかった基準に貢献する：</w:t>
+        <w:t>疫学における因果判断の古典的枠組みである Hill の9基準 [10] に照らすと、スペクトル因果性は従来手法がカバーしていなかった基準に貢献する：</w:t>
       </w:r>
     </w:p>
     <w:tbl>
@@ -8619,7 +8619,7 @@
         <w:rPr>
           <w:b w:val="0"/>
         </w:rPr>
-        <w:t>磁気ラプラシアンは元来、量子力学における磁場中の荷電粒子のハミルトニアンに由来するが、ネットワーク科学への応用は Fanuel &amp; Suykens (2017a) が先駆的である。彼らはラプラシアンの「変形（deformation）」としてパラメータ付きラプラシアン族を構築し、有向ネットワークにおけるスペクトルランキングを実現した。最小固有値に対応する固有ベクトルのエントリがノードのランキングスコアを直接与え、変形パラメータにより top-</w:t>
+        <w:t>磁気ラプラシアンは元来、量子力学における磁場中の荷電粒子のハミルトニアンに由来するが、ネットワーク科学への応用は Fanuel &amp; Suykens [11] が先駆的である。彼らはラプラシアンの「変形（deformation）」としてパラメータ付きラプラシアン族を構築し、有向ネットワークにおけるスペクトルランキングを実現した。最小固有値に対応する固有ベクトルのエントリがノードのランキングスコアを直接与え、変形パラメータにより top-</w:t>
       </w:r>
       <w:r>
         <w:rPr>
@@ -8639,7 +8639,7 @@
         <w:rPr>
           <w:b w:val="0"/>
         </w:rPr>
-        <w:t xml:space="preserve">同グループは磁気ラプラシアンの固有マップ（magnetic eigenmaps）を有向ネットワークのコミュニティ検出に適用し (Fanuel, Alaíz &amp; Suykens, 2017b)、Aharonov-Bohm 位相に基づく方向性符号化が、ランダムウォークベースの既存手法を上回る性能を発揮することを実証した。特に、有限温度での「フラックスコミュニティ」概念は、本稿の電荷パラメータ </w:t>
+        <w:t xml:space="preserve">同グループは磁気ラプラシアンの固有マップ（magnetic eigenmaps）を有向ネットワークのコミュニティ検出に適用し [12]、Aharonov-Bohm 位相に基づく方向性符号化が、ランダムウォークベースの既存手法を上回る性能を発揮することを実証した。特に、有限温度での「フラックスコミュニティ」概念は、本稿の電荷パラメータ </w:t>
       </w:r>
       <w:r>
         <w:rPr>
@@ -8659,7 +8659,7 @@
         <w:rPr>
           <w:b w:val="0"/>
         </w:rPr>
-        <w:t>de Resende &amp; da Costa (2020) は磁気ラプラシアンのスペクトルを大規模有向ネットワーク（</w:t>
+        <w:t>de Resende &amp; da Costa [7] は磁気ラプラシアンのスペクトルを大規模有向ネットワーク（</w:t>
       </w:r>
       <w:r>
         <w:rPr>
@@ -8729,7 +8729,7 @@
         <w:rPr>
           <w:b w:val="0"/>
         </w:rPr>
-        <w:t>Zhang et al. (2021) は MagNet として磁気ラプラシアンベースのグラフニューラルネットワーク（GNN）を提案し、有向グラフのノード分類・リンク予測において既存 GNN を凌駕する性能を示した。本稿は学習ベースのアプローチではなく因果推論への転用であるが、磁気ラプラシアンの方向性符号化能力の実証として重要な先行研究である。</w:t>
+        <w:t>Zhang et al. [8] は MagNet として磁気ラプラシアンベースのグラフニューラルネットワーク（GNN）を提案し、有向グラフのノード分類・リンク予測において既存 GNN を凌駕する性能を示した。本稿は学習ベースのアプローチではなく因果推論への転用であるが、磁気ラプラシアンの方向性符号化能力の実証として重要な先行研究である。</w:t>
       </w:r>
     </w:p>
     <w:p>
@@ -8748,7 +8748,7 @@
         <w:rPr>
           <w:b w:val="0"/>
         </w:rPr>
-        <w:t xml:space="preserve">Hodge 分解のネットワーク科学への応用は Jiang et al. (2011) による統計的ランキングへの適用が出発点である。彼らは不完全なペアワイズ比較データ（映画評価、スポーツ対戦等）から、Hodge 分解の勾配成分で大域的ランキングを、カール成分でランキングの非整合性（intransitivity）を定量化した。本稿の因果ポテンシャル </w:t>
+        <w:t xml:space="preserve">Hodge 分解のネットワーク科学への応用は Jiang et al. [9] による統計的ランキングへの適用が出発点である。彼らは不完全なペアワイズ比較データ（映画評価、スポーツ対戦等）から、Hodge 分解の勾配成分で大域的ランキングを、カール成分でランキングの非整合性（intransitivity）を定量化した。本稿の因果ポテンシャル </w:t>
       </w:r>
       <w:r>
         <w:rPr>
@@ -8768,7 +8768,7 @@
         <w:rPr>
           <w:b w:val="0"/>
         </w:rPr>
-        <w:t>Maehara &amp; Ohkawa は単一細胞 RNA シーケンシングデータに Hodge 分解を適用した ddHodge を提案した (2019)。同手法は2025年に Nature Communications に掲載され (Maehara &amp; Ohkawa, 2025)、高次元遺伝子発現動態を低次元データ多様体上で再構築し、勾配・カール・ダイバージェンスの全基本成分を正確に復元した。特に、マウス胚発生の scRNA-seq データへの適用により、発生過程の遺伝子発現動態が</w:t>
+        <w:t>Maehara &amp; Ohkawa は単一細胞 RNA シーケンシングデータに Hodge 分解を適用した ddHodge を提案した [13]。同手法は2025年に Nature Communications に掲載され [14]、高次元遺伝子発現動態を低次元データ多様体上で再構築し、勾配・カール・ダイバージェンスの全基本成分を正確に復元した。特に、マウス胚発生の scRNA-seq データへの適用により、発生過程の遺伝子発現動態が</w:t>
       </w:r>
       <w:r>
         <w:rPr>
@@ -8799,7 +8799,7 @@
         <w:rPr>
           <w:b w:val="0"/>
         </w:rPr>
-        <w:t>Shuman et al. (2013) が確立したグラフ信号処理（GSP）はグラフラプラシアンの固有分解をフーリエ変換のアナロジーとして用いるが、主に無向グラフを対象としていた。</w:t>
+        <w:t>Shuman et al. [6] が確立したグラフ信号処理（GSP）はグラフラプラシアンの固有分解をフーリエ変換のアナロジーとして用いるが、主に無向グラフを対象としていた。</w:t>
       </w:r>
     </w:p>
     <w:p>
@@ -8807,7 +8807,7 @@
         <w:rPr>
           <w:b w:val="0"/>
         </w:rPr>
-        <w:t>Seifert, Wendler &amp; Püschel (2023) は DAG 上の因果フーリエ解析を定義し、「原因が少数（few causes）」というフーリエスパース性仮定の下で因果信号の復元を理論的に保証した。Misiakos, Mihal &amp; Püschel (2024) はこの枠組みを時系列グラフデータに拡張し、時間展開 DAG 上での構造方程式モデルからの信号とグラフの同時学習を ICASSP 2024 で報告した。また、Stanković et al. (2024) は DAG の隣接行列の固有値が全てゼロとなる本質的問題（通常のスペクトル解析が適用不可）に対し、グラフゼロパディング手法を提案して DAG 上のフーリエ変換を可能にした。</w:t>
+        <w:t>Seifert, Wendler &amp; Püschel [15] は DAG 上の因果フーリエ解析を定義し、「原因が少数（few causes）」というフーリエスパース性仮定の下で因果信号の復元を理論的に保証した。Misiakos, Mihal &amp; Püschel [16] はこの枠組みを時系列グラフデータに拡張し、時間展開 DAG 上での構造方程式モデルからの信号とグラフの同時学習を ICASSP 2024 で報告した。また、Stanković et al. [17] は DAG の隣接行列の固有値が全てゼロとなる本質的問題（通常のスペクトル解析が適用不可）に対し、グラフゼロパディング手法を提案して DAG 上のフーリエ変換を可能にした。</w:t>
       </w:r>
     </w:p>
     <w:p>
@@ -8845,7 +8845,7 @@
         <w:rPr>
           <w:b w:val="0"/>
         </w:rPr>
-        <w:t xml:space="preserve">Zheng et al. (2018) は NOTEARS において、DAG の非巡回制約を </w:t>
+        <w:t xml:space="preserve">Zheng et al. [18] は NOTEARS において、DAG の非巡回制約を </w:t>
       </w:r>
       <w:r>
         <w:rPr>
@@ -8895,7 +8895,7 @@
         <w:rPr>
           <w:b w:val="0"/>
         </w:rPr>
-        <w:t xml:space="preserve"> の離散的探索空間が通常の連続最適化に帰着された。Ng, Ghassami &amp; Zhang (2020) は GOLEM として NOTEARS の最適化効率を改善し、スパース性制約と DAG 制約の役割を理論的に分離した。</w:t>
+        <w:t xml:space="preserve"> の離散的探索空間が通常の連続最適化に帰着された。Ng, Ghassami &amp; Zhang [19] は GOLEM として NOTEARS の最適化効率を改善し、スパース性制約と DAG 制約の役割を理論的に分離した。</w:t>
       </w:r>
     </w:p>
     <w:p>
@@ -8903,7 +8903,7 @@
         <w:rPr>
           <w:b w:val="0"/>
         </w:rPr>
-        <w:t xml:space="preserve">M'Charrak et al. (2025) は科学的実践において観測変数が「同一因果システムに属する」という暗黙の仮定を形式化し、グラフラプラシアンの Fiedler 固有値 </w:t>
+        <w:t xml:space="preserve">M'Charrak et al. [20] は科学的実践において観測変数が「同一因果システムに属する」という暗黙の仮定を形式化し、グラフラプラシアンの Fiedler 固有値 </w:t>
       </w:r>
       <w:r>
         <w:rPr>
@@ -8959,7 +8959,7 @@
         <w:rPr>
           <w:b w:val="0"/>
         </w:rPr>
-        <w:t>Schreiber (2000) が提案した</w:t>
+        <w:t>Schreiber [21] が提案した</w:t>
       </w:r>
       <w:r>
         <w:rPr>
@@ -8979,7 +8979,7 @@
         <w:rPr>
           <w:b w:val="0"/>
         </w:rPr>
-        <w:t>Sugihara et al. (2012) の</w:t>
+        <w:t>Sugihara et al. [22] の</w:t>
       </w:r>
       <w:r>
         <w:rPr>
@@ -9080,7 +9080,7 @@
         <w:rPr>
           <w:b w:val="0"/>
         </w:rPr>
-        <w:t>Shimizu et al. (2011) の DirectLiNGAM は逐次的な非ガウス性テストにより因果順序を直接推定する手法であり、§8以降の実データ解析のベースラインとして用いている。</w:t>
+        <w:t>Shimizu et al. [5] の DirectLiNGAM は逐次的な非ガウス性テストにより因果順序を直接推定する手法であり、§8以降の実データ解析のベースラインとして用いている。</w:t>
       </w:r>
     </w:p>
     <w:p>
@@ -9088,7 +9088,7 @@
         <w:rPr>
           <w:b w:val="0"/>
         </w:rPr>
-        <w:t>Kotoku et al. (2020) は大阪府特定健診データ（約10万人、2012–2017年度）に DirectLiNGAM を適用し、健診指標間の因果構造を推定した。年齢が最上流に位置し、BMI・血圧・脂質指標の因果連鎖を同定した結果は、本稿の UCI 心疾患データでの知見（Age → MaxHR → STDep）と整合する。</w:t>
+        <w:t>Kotoku et al. [23] は大阪府特定健診データ（約10万人、2012–2017年度）に DirectLiNGAM を適用し、健診指標間の因果構造を推定した。年齢が最上流に位置し、BMI・血圧・脂質指標の因果連鎖を同定した結果は、本稿の UCI 心疾患データでの知見（Age → MaxHR → STDep）と整合する。</w:t>
       </w:r>
     </w:p>
     <w:p>
@@ -9096,7 +9096,7 @@
         <w:rPr>
           <w:b w:val="0"/>
         </w:rPr>
-        <w:t>Okuda et al. (2025) は日本の健診コホート（</w:t>
+        <w:t>Okuda et al. [24] は日本の健診コホート（</w:t>
       </w:r>
       <w:r>
         <w:rPr>
@@ -9145,7 +9145,7 @@
         <w:rPr>
           <w:b w:val="0"/>
         </w:rPr>
-        <w:t>大規模言語モデル（LLM）の因果推論能力は急速に注目を集めている。Le, Xia &amp; Chen (2024) は複数の LLM エージェントが議論を通じて統計的因果探索手法を選択し、発見された因果グラフをさらに精錬する MAC（Multi-Agent Causal discovery）フレームワークを提案した。LLM が持つメタデータ（変数名・ドメイン知識）と統計的手法を組み合わせるアプローチは、本稿のユーティリティ関数構成（§13.2参照）に LLM を活用する構想と方向性が一致する。</w:t>
+        <w:t>大規模言語モデル（LLM）の因果推論能力は急速に注目を集めている。Le, Xia &amp; Chen [25] は複数の LLM エージェントが議論を通じて統計的因果探索手法を選択し、発見された因果グラフをさらに精錬する MAC（Multi-Agent Causal discovery）フレームワークを提案した。LLM が持つメタデータ（変数名・ドメイン知識）と統計的手法を組み合わせるアプローチは、本稿のユーティリティ関数構成（§13.2参照）に LLM を活用する構想と方向性が一致する。</w:t>
       </w:r>
     </w:p>
     <w:p>
@@ -9153,7 +9153,7 @@
         <w:rPr>
           <w:b w:val="0"/>
         </w:rPr>
-        <w:t>Sheth, Fatemi &amp; Fritz (2025) は CausalGraph2LLM において、LLM の因果クエリ（因果構造の推論、介入効果の推定等）に対する体系的評価を行い、LLM が因果グラフの構造理解で一定の能力を持つ一方、推移的因果関係の推論に弱点があることを示した。この知見はユーティリティ関数の LLM ベース構成の限界を理解する上で重要である。</w:t>
+        <w:t>Sheth, Fatemi &amp; Fritz [26] は CausalGraph2LLM において、LLM の因果クエリ（因果構造の推論、介入効果の推定等）に対する体系的評価を行い、LLM が因果グラフの構造理解で一定の能力を持つ一方、推移的因果関係の推論に弱点があることを示した。この知見はユーティリティ関数の LLM ベース構成の限界を理解する上で重要である。</w:t>
       </w:r>
     </w:p>
     <w:p>
@@ -9172,7 +9172,7 @@
         <w:rPr>
           <w:b w:val="0"/>
         </w:rPr>
-        <w:t>Wein et al. (2021) はグラフニューラルネットワーク（GNN）を用いた脳ネットワークの因果推論フレームワークを提案し、構造的結合（DTI）と機能的活動（fMRI）のマルチモーダル統合を実現した。GNN が長期依存性を捕捉し、Granger 因果ベースの VAR モデルを上回る性能を示した点は、グラフ構造を明示的に利用する因果推論の有効性を支持する。</w:t>
+        <w:t>Wein et al. [27] はグラフニューラルネットワーク（GNN）を用いた脳ネットワークの因果推論フレームワークを提案し、構造的結合（DTI）と機能的活動（fMRI）のマルチモーダル統合を実現した。GNN が長期依存性を捕捉し、Granger 因果ベースの VAR モデルを上回る性能を示した点は、グラフ構造を明示的に利用する因果推論の有効性を支持する。</w:t>
       </w:r>
     </w:p>
     <w:p>
@@ -9180,7 +9180,7 @@
         <w:rPr>
           <w:b w:val="0"/>
         </w:rPr>
-        <w:t>Bernal-González et al. (2025) はブール論理に基づく「論理有向グラフ（logical digraph）」を提案し、生物学的制御ネットワークにおける同期的調節関係の表現と解析を可能にした。因果グラフの構造的性質（極限周期、アトラクタ）を直接解析できる点で、本稿のスペクトル的アプローチとは相補的な視点を提供する。</w:t>
+        <w:t>Bernal-González et al. [28] はブール論理に基づく「論理有向グラフ（logical digraph）」を提案し、生物学的制御ネットワークにおける同期的調節関係の表現と解析を可能にした。因果グラフの構造的性質（極限周期、アトラクタ）を直接解析できる点で、本稿のスペクトル的アプローチとは相補的な視点を提供する。</w:t>
       </w:r>
     </w:p>
     <w:p>
@@ -9199,7 +9199,7 @@
         <w:rPr>
           <w:b w:val="0"/>
         </w:rPr>
-        <w:t>Liu et al. (2026) は観察医学研究における因果探索のスコーピングレビューを行い、制約ベース（PC, FCI）、スコアベース（GES, NOTEARS）、関数ベース（LiNGAM）の三大カテゴリを整理した。医療分野特有の課題として、(a) 高次元・低サンプル設定、(b) 混合データ型（連続・離散・打ち切り）、(c) 時変交絡、(d) 欠測データを挙げている。スペクトル因果性は (a) にスペクトル分解の次元圧縮特性で、(b) にユーティリティ関数の柔軟性で、(d) にグラフ構造の頑健性でそれぞれ対応しうる。</w:t>
+        <w:t>Liu et al. [29] は観察医学研究における因果探索のスコーピングレビューを行い、制約ベース（PC, FCI）、スコアベース（GES, NOTEARS）、関数ベース（LiNGAM）の三大カテゴリを整理した。医療分野特有の課題として、(a) 高次元・低サンプル設定、(b) 混合データ型（連続・離散・打ち切り）、(c) 時変交絡、(d) 欠測データを挙げている。スペクトル因果性は (a) にスペクトル分解の次元圧縮特性で、(b) にユーティリティ関数の柔軟性で、(d) にグラフ構造の頑健性でそれぞれ対応しうる。</w:t>
       </w:r>
     </w:p>
     <w:p>
@@ -9322,7 +9322,7 @@
                 <w:b w:val="0"/>
                 <w:sz w:val="18"/>
               </w:rPr>
-              <w:t>Fanuel &amp; Suykens (2017a,b); de Resende &amp; da Costa (2020); Zhang et al. (2021)</w:t>
+              <w:t>Fanuel &amp; Suykens [11, 12]; de Resende &amp; da Costa [7]; Zhang et al. [8]</w:t>
             </w:r>
           </w:p>
         </w:tc>
@@ -9378,7 +9378,7 @@
                 <w:b w:val="0"/>
                 <w:sz w:val="18"/>
               </w:rPr>
-              <w:t>Jiang et al. (2011); Maehara &amp; Ohkawa (2019, 2025)</w:t>
+              <w:t>Jiang et al. [9]; Maehara &amp; Ohkawa [13, 14]</w:t>
             </w:r>
           </w:p>
         </w:tc>
@@ -9434,7 +9434,7 @@
                 <w:b w:val="0"/>
                 <w:sz w:val="18"/>
               </w:rPr>
-              <w:t>Seifert et al. (2023); Misiakos et al. (2024); Stanković et al. (2024)</w:t>
+              <w:t>Seifert et al. [15]; Misiakos et al. [16]; Stanković et al. [17]</w:t>
             </w:r>
           </w:p>
         </w:tc>
@@ -9490,7 +9490,7 @@
                 <w:b w:val="0"/>
                 <w:sz w:val="18"/>
               </w:rPr>
-              <w:t>NOTEARS (Zheng et al., 2018); GOLEM (Ng et al., 2020); M'Charrak et al. (2025)</w:t>
+              <w:t>NOTEARS [18]; GOLEM [19]; M'Charrak et al. [20]</w:t>
             </w:r>
           </w:p>
         </w:tc>
@@ -9546,7 +9546,7 @@
                 <w:b w:val="0"/>
                 <w:sz w:val="18"/>
               </w:rPr>
-              <w:t>TE (Schreiber, 2000); CCM (Sugihara et al., 2012)</w:t>
+              <w:t>TE [21]; CCM [22]</w:t>
             </w:r>
           </w:p>
         </w:tc>
@@ -9602,7 +9602,7 @@
                 <w:b w:val="0"/>
                 <w:sz w:val="18"/>
               </w:rPr>
-              <w:t>Kotoku et al. (2020); Okuda et al. (2025)</w:t>
+              <w:t>Kotoku et al. [23]; Okuda et al. [24]</w:t>
             </w:r>
           </w:p>
         </w:tc>
@@ -9658,7 +9658,7 @@
                 <w:b w:val="0"/>
                 <w:sz w:val="18"/>
               </w:rPr>
-              <w:t>Le et al. (2024); Sheth et al. (2025)</w:t>
+              <w:t>Le et al. [25]; Sheth et al. [26]</w:t>
             </w:r>
           </w:p>
         </w:tc>
@@ -9714,7 +9714,7 @@
                 <w:b w:val="0"/>
                 <w:sz w:val="18"/>
               </w:rPr>
-              <w:t>Wein et al. (2021); Bernal-González et al. (2025)</w:t>
+              <w:t>Wein et al. [27]; Bernal-González et al. [28]</w:t>
             </w:r>
           </w:p>
         </w:tc>
@@ -9770,7 +9770,7 @@
                 <w:b w:val="0"/>
                 <w:sz w:val="18"/>
               </w:rPr>
-              <w:t>Liu et al. (2026)</w:t>
+              <w:t>Liu et al. [29]</w:t>
             </w:r>
           </w:p>
         </w:tc>
@@ -9866,7 +9866,7 @@
         <w:rPr>
           <w:b w:val="0"/>
         </w:rPr>
-        <w:t>UCI Heart Disease Dataset (Cleveland subset; Detrano et al., 1989) の連続変数5つを用いた：</w:t>
+        <w:t>UCI Heart Disease Dataset (Cleveland subset; Detrano et al. [30]) の連続変数5つを用いた：</w:t>
       </w:r>
     </w:p>
     <w:p>
@@ -9982,7 +9982,7 @@
         <w:rPr>
           <w:b w:val="0"/>
         </w:rPr>
-        <w:t xml:space="preserve">DirectLiNGAM (Shimizu et al., 2011) を適用し、因果順序と因果効果行列 </w:t>
+        <w:t xml:space="preserve">DirectLiNGAM [5] を適用し、因果順序と因果効果行列 </w:t>
       </w:r>
       <w:r>
         <w:rPr>
@@ -21024,7 +21024,7 @@
         <w:rPr>
           <w:b w:val="0"/>
         </w:rPr>
-        <w:t>; Okuda et al., 2025）での再現性評価</w:t>
+        <w:t>; Okuda et al. [24]）での再現性評価</w:t>
       </w:r>
     </w:p>
     <w:p>
@@ -22334,8 +22334,14 @@
     </w:p>
     <w:p>
       <w:pPr>
-        <w:pStyle w:val="ListNumber"/>
+        <w:ind w:left="567" w:hanging="567"/>
       </w:pPr>
+      <w:r>
+        <w:rPr>
+          <w:sz w:val="20"/>
+        </w:rPr>
+        <w:t xml:space="preserve">1. </w:t>
+      </w:r>
       <w:r>
         <w:rPr>
           <w:b w:val="0"/>
@@ -22358,37 +22364,49 @@
     </w:p>
     <w:p>
       <w:pPr>
-        <w:pStyle w:val="ListNumber"/>
+        <w:ind w:left="567" w:hanging="567"/>
       </w:pPr>
       <w:r>
         <w:rPr>
-          <w:b w:val="0"/>
-        </w:rPr>
-        <w:t xml:space="preserve">Shimizu, S., Hoyer, P.O., Hyvärinen, A. &amp; Kerminen, A. (2006). A linear non-Gaussian acyclic model for causal discovery. </w:t>
+          <w:sz w:val="20"/>
+        </w:rPr>
+        <w:t xml:space="preserve">2. </w:t>
+      </w:r>
+      <w:r>
+        <w:rPr>
+          <w:b w:val="0"/>
+        </w:rPr>
+        <w:t xml:space="preserve">Rubin, D.B. (1974). Estimating causal effects of treatments in randomized and nonrandomized studies. </w:t>
       </w:r>
       <w:r>
         <w:rPr>
           <w:b w:val="0"/>
           <w:i/>
         </w:rPr>
-        <w:t>Journal of Machine Learning Research</w:t>
-      </w:r>
-      <w:r>
-        <w:rPr>
-          <w:b w:val="0"/>
-        </w:rPr>
-        <w:t>, 7, 2003–2030.</w:t>
+        <w:t>Journal of Educational Psychology</w:t>
+      </w:r>
+      <w:r>
+        <w:rPr>
+          <w:b w:val="0"/>
+        </w:rPr>
+        <w:t>, 66(5), 688–701.</w:t>
       </w:r>
     </w:p>
     <w:p>
       <w:pPr>
-        <w:pStyle w:val="ListNumber"/>
+        <w:ind w:left="567" w:hanging="567"/>
       </w:pPr>
       <w:r>
         <w:rPr>
-          <w:b w:val="0"/>
-        </w:rPr>
-        <w:t xml:space="preserve">Shimizu, S., Inazumi, T., Sogawa, Y., Hyvärinen, A., Kawahara, Y., Washio, T., Hoyer, P.O. &amp; Bollen, K. (2011). DirectLiNGAM: A direct method for learning a linear non-Gaussian structural equation model. </w:t>
+          <w:sz w:val="20"/>
+        </w:rPr>
+        <w:t xml:space="preserve">3. </w:t>
+      </w:r>
+      <w:r>
+        <w:rPr>
+          <w:b w:val="0"/>
+        </w:rPr>
+        <w:t xml:space="preserve">Shimizu, S., Hoyer, P.O., Hyvärinen, A. &amp; Kerminen, A. (2006). A linear non-Gaussian acyclic model for causal discovery. </w:t>
       </w:r>
       <w:r>
         <w:rPr>
@@ -22401,61 +22419,79 @@
         <w:rPr>
           <w:b w:val="0"/>
         </w:rPr>
-        <w:t>, 12, 1225–1248.</w:t>
+        <w:t>, 7, 2003–2030.</w:t>
       </w:r>
     </w:p>
     <w:p>
       <w:pPr>
-        <w:pStyle w:val="ListNumber"/>
+        <w:ind w:left="567" w:hanging="567"/>
       </w:pPr>
       <w:r>
         <w:rPr>
-          <w:b w:val="0"/>
-        </w:rPr>
-        <w:t xml:space="preserve">Hill, A.B. (1965). The environment and disease: Association or causation? </w:t>
+          <w:sz w:val="20"/>
+        </w:rPr>
+        <w:t xml:space="preserve">4. </w:t>
+      </w:r>
+      <w:r>
+        <w:rPr>
+          <w:b w:val="0"/>
+        </w:rPr>
+        <w:t xml:space="preserve">Granger, C.W.J. (1969). Investigating causal relations by econometric models and cross-spectral methods. </w:t>
       </w:r>
       <w:r>
         <w:rPr>
           <w:b w:val="0"/>
           <w:i/>
         </w:rPr>
-        <w:t>Proceedings of the Royal Society of Medicine</w:t>
-      </w:r>
-      <w:r>
-        <w:rPr>
-          <w:b w:val="0"/>
-        </w:rPr>
-        <w:t>, 58, 295–300.</w:t>
+        <w:t>Econometrica</w:t>
+      </w:r>
+      <w:r>
+        <w:rPr>
+          <w:b w:val="0"/>
+        </w:rPr>
+        <w:t>, 37(3), 424–438.</w:t>
       </w:r>
     </w:p>
     <w:p>
       <w:pPr>
-        <w:pStyle w:val="ListNumber"/>
+        <w:ind w:left="567" w:hanging="567"/>
       </w:pPr>
       <w:r>
         <w:rPr>
-          <w:b w:val="0"/>
-        </w:rPr>
-        <w:t xml:space="preserve">Granger, C.W.J. (1969). Investigating causal relations by econometric models and cross-spectral methods. </w:t>
+          <w:sz w:val="20"/>
+        </w:rPr>
+        <w:t xml:space="preserve">5. </w:t>
+      </w:r>
+      <w:r>
+        <w:rPr>
+          <w:b w:val="0"/>
+        </w:rPr>
+        <w:t xml:space="preserve">Shimizu, S., Inazumi, T., Sogawa, Y., Hyvärinen, A., Kawahara, Y., Washio, T., Hoyer, P.O. &amp; Bollen, K. (2011). DirectLiNGAM: A direct method for learning a linear non-Gaussian structural equation model. </w:t>
       </w:r>
       <w:r>
         <w:rPr>
           <w:b w:val="0"/>
           <w:i/>
         </w:rPr>
-        <w:t>Econometrica</w:t>
-      </w:r>
-      <w:r>
-        <w:rPr>
-          <w:b w:val="0"/>
-        </w:rPr>
-        <w:t>, 37(3), 424–438.</w:t>
+        <w:t>Journal of Machine Learning Research</w:t>
+      </w:r>
+      <w:r>
+        <w:rPr>
+          <w:b w:val="0"/>
+        </w:rPr>
+        <w:t>, 12, 1225–1248.</w:t>
       </w:r>
     </w:p>
     <w:p>
       <w:pPr>
-        <w:pStyle w:val="ListNumber"/>
+        <w:ind w:left="567" w:hanging="567"/>
       </w:pPr>
+      <w:r>
+        <w:rPr>
+          <w:sz w:val="20"/>
+        </w:rPr>
+        <w:t xml:space="preserve">6. </w:t>
+      </w:r>
       <w:r>
         <w:rPr>
           <w:b w:val="0"/>
@@ -22478,116 +22514,146 @@
     </w:p>
     <w:p>
       <w:pPr>
-        <w:pStyle w:val="ListNumber"/>
+        <w:ind w:left="567" w:hanging="567"/>
       </w:pPr>
       <w:r>
         <w:rPr>
-          <w:b w:val="0"/>
-        </w:rPr>
-        <w:t xml:space="preserve">Zhang, X., He, Y., Bruber, N., Hooi, B. &amp; Zhu, L. (2022). MagNet: A neural network for directed graphs. In </w:t>
+          <w:sz w:val="20"/>
+        </w:rPr>
+        <w:t xml:space="preserve">7. </w:t>
+      </w:r>
+      <w:r>
+        <w:rPr>
+          <w:b w:val="0"/>
+        </w:rPr>
+        <w:t xml:space="preserve">de Resende, B.M.F. &amp; da Costa, L.F. (2020). Characterization and comparison of large directed networks through the spectra of the magnetic Laplacian. </w:t>
       </w:r>
       <w:r>
         <w:rPr>
           <w:b w:val="0"/>
           <w:i/>
         </w:rPr>
-        <w:t>Advances in Neural Information Processing Systems</w:t>
-      </w:r>
-      <w:r>
-        <w:rPr>
-          <w:b w:val="0"/>
-        </w:rPr>
-        <w:t xml:space="preserve"> (NeurIPS 2021).</w:t>
+        <w:t>Chaos</w:t>
+      </w:r>
+      <w:r>
+        <w:rPr>
+          <w:b w:val="0"/>
+        </w:rPr>
+        <w:t>, 30(7), 073141.</w:t>
       </w:r>
     </w:p>
     <w:p>
       <w:pPr>
-        <w:pStyle w:val="ListNumber"/>
+        <w:ind w:left="567" w:hanging="567"/>
       </w:pPr>
       <w:r>
         <w:rPr>
-          <w:b w:val="0"/>
-        </w:rPr>
-        <w:t xml:space="preserve">de Resende, B.M.F. &amp; da Costa, L.F. (2020). Characterization and comparison of large directed networks through the spectra of the magnetic Laplacian. </w:t>
+          <w:sz w:val="20"/>
+        </w:rPr>
+        <w:t xml:space="preserve">8. </w:t>
+      </w:r>
+      <w:r>
+        <w:rPr>
+          <w:b w:val="0"/>
+        </w:rPr>
+        <w:t xml:space="preserve">Zhang, X., He, Y., Bruber, N., Hooi, B. &amp; Zhu, L. (2022). MagNet: A neural network for directed graphs. In </w:t>
       </w:r>
       <w:r>
         <w:rPr>
           <w:b w:val="0"/>
           <w:i/>
         </w:rPr>
-        <w:t>Chaos</w:t>
-      </w:r>
-      <w:r>
-        <w:rPr>
-          <w:b w:val="0"/>
-        </w:rPr>
-        <w:t>, 30(7), 073141.</w:t>
+        <w:t>Advances in Neural Information Processing Systems</w:t>
+      </w:r>
+      <w:r>
+        <w:rPr>
+          <w:b w:val="0"/>
+        </w:rPr>
+        <w:t xml:space="preserve"> (NeurIPS 2021).</w:t>
       </w:r>
     </w:p>
     <w:p>
       <w:pPr>
-        <w:pStyle w:val="ListNumber"/>
+        <w:ind w:left="567" w:hanging="567"/>
       </w:pPr>
       <w:r>
         <w:rPr>
-          <w:b w:val="0"/>
-        </w:rPr>
-        <w:t xml:space="preserve">Seifert, B., Wendler, C. &amp; Püschel, M. (2023). Causal Fourier analysis on directed acyclic graphs and posets. </w:t>
+          <w:sz w:val="20"/>
+        </w:rPr>
+        <w:t xml:space="preserve">9. </w:t>
+      </w:r>
+      <w:r>
+        <w:rPr>
+          <w:b w:val="0"/>
+        </w:rPr>
+        <w:t xml:space="preserve">Jiang, X., Lim, L.H., Yao, Y. &amp; Ye, Y. (2011). Statistical ranking and combinatorial Hodge theory. </w:t>
       </w:r>
       <w:r>
         <w:rPr>
           <w:b w:val="0"/>
           <w:i/>
         </w:rPr>
-        <w:t>IEEE Transactions on Signal Processing</w:t>
-      </w:r>
-      <w:r>
-        <w:rPr>
-          <w:b w:val="0"/>
-        </w:rPr>
-        <w:t>, 71, 3516–3530.</w:t>
+        <w:t>Mathematical Programming</w:t>
+      </w:r>
+      <w:r>
+        <w:rPr>
+          <w:b w:val="0"/>
+        </w:rPr>
+        <w:t>, 127, 203–244.</w:t>
       </w:r>
     </w:p>
     <w:p>
       <w:pPr>
-        <w:pStyle w:val="ListNumber"/>
+        <w:ind w:left="567" w:hanging="567"/>
       </w:pPr>
       <w:r>
         <w:rPr>
-          <w:b w:val="0"/>
-        </w:rPr>
-        <w:t xml:space="preserve">Jiang, X., Lim, L.H., Yao, Y. &amp; Ye, Y. (2011). Statistical ranking and combinatorial Hodge theory. </w:t>
+          <w:sz w:val="20"/>
+        </w:rPr>
+        <w:t xml:space="preserve">10. </w:t>
+      </w:r>
+      <w:r>
+        <w:rPr>
+          <w:b w:val="0"/>
+        </w:rPr>
+        <w:t xml:space="preserve">Hill, A.B. (1965). The environment and disease: Association or causation? </w:t>
       </w:r>
       <w:r>
         <w:rPr>
           <w:b w:val="0"/>
           <w:i/>
         </w:rPr>
-        <w:t>Mathematical Programming</w:t>
-      </w:r>
-      <w:r>
-        <w:rPr>
-          <w:b w:val="0"/>
-        </w:rPr>
-        <w:t>, 127, 203–244.</w:t>
+        <w:t>Proceedings of the Royal Society of Medicine</w:t>
+      </w:r>
+      <w:r>
+        <w:rPr>
+          <w:b w:val="0"/>
+        </w:rPr>
+        <w:t>, 58, 295–300.</w:t>
       </w:r>
     </w:p>
     <w:p>
       <w:pPr>
-        <w:pStyle w:val="ListNumber"/>
+        <w:ind w:left="567" w:hanging="567"/>
       </w:pPr>
       <w:r>
         <w:rPr>
-          <w:b w:val="0"/>
-        </w:rPr>
-        <w:t xml:space="preserve">Maehara, K. &amp; Ohkawa, Y. (2019). Modeling latent flows on single-cell data using the Hodge decomposition. </w:t>
+          <w:sz w:val="20"/>
+        </w:rPr>
+        <w:t xml:space="preserve">11. </w:t>
+      </w:r>
+      <w:r>
+        <w:rPr>
+          <w:b w:val="0"/>
+        </w:rPr>
+        <w:t xml:space="preserve">Fanuel, M. &amp; Suykens, J.A.K. (2017a). Deformed Laplacians and spectral ranking in directed networks. </w:t>
       </w:r>
       <w:r>
         <w:rPr>
           <w:b w:val="0"/>
           <w:i/>
         </w:rPr>
-        <w:t>bioRxiv</w:t>
+        <w:t>arXiv:1511.00492</w:t>
       </w:r>
       <w:r>
         <w:rPr>
@@ -22598,44 +22664,56 @@
     </w:p>
     <w:p>
       <w:pPr>
-        <w:pStyle w:val="ListNumber"/>
+        <w:ind w:left="567" w:hanging="567"/>
       </w:pPr>
       <w:r>
         <w:rPr>
-          <w:b w:val="0"/>
-        </w:rPr>
-        <w:t xml:space="preserve">Kotoku, J. et al. (2020). Causal relations of health indices inferred statistically using the DirectLiNGAM algorithm from a cross-sectional study. </w:t>
+          <w:sz w:val="20"/>
+        </w:rPr>
+        <w:t xml:space="preserve">12. </w:t>
+      </w:r>
+      <w:r>
+        <w:rPr>
+          <w:b w:val="0"/>
+        </w:rPr>
+        <w:t xml:space="preserve">Fanuel, M., Alaíz, C.M. &amp; Suykens, J.A.K. (2017b). Magnetic eigenmaps for community detection in directed networks. </w:t>
       </w:r>
       <w:r>
         <w:rPr>
           <w:b w:val="0"/>
           <w:i/>
         </w:rPr>
-        <w:t>PLOS ONE</w:t>
-      </w:r>
-      <w:r>
-        <w:rPr>
-          <w:b w:val="0"/>
-        </w:rPr>
-        <w:t>, 15(12), e0243229.</w:t>
+        <w:t>Physical Review E</w:t>
+      </w:r>
+      <w:r>
+        <w:rPr>
+          <w:b w:val="0"/>
+        </w:rPr>
+        <w:t>, 95, 022302.</w:t>
       </w:r>
     </w:p>
     <w:p>
       <w:pPr>
-        <w:pStyle w:val="ListNumber"/>
+        <w:ind w:left="567" w:hanging="567"/>
       </w:pPr>
       <w:r>
         <w:rPr>
-          <w:b w:val="0"/>
-        </w:rPr>
-        <w:t xml:space="preserve">Okuda, S. et al. (2025). Operationalizing longitudinal causal discovery under real-world workflow constraints. </w:t>
+          <w:sz w:val="20"/>
+        </w:rPr>
+        <w:t xml:space="preserve">13. </w:t>
+      </w:r>
+      <w:r>
+        <w:rPr>
+          <w:b w:val="0"/>
+        </w:rPr>
+        <w:t xml:space="preserve">Maehara, K. &amp; Ohkawa, Y. (2019). Modeling latent flows on single-cell data using the Hodge decomposition. </w:t>
       </w:r>
       <w:r>
         <w:rPr>
           <w:b w:val="0"/>
           <w:i/>
         </w:rPr>
-        <w:t>arXiv:2602.23800</w:t>
+        <w:t>bioRxiv</w:t>
       </w:r>
       <w:r>
         <w:rPr>
@@ -22646,68 +22724,86 @@
     </w:p>
     <w:p>
       <w:pPr>
-        <w:pStyle w:val="ListNumber"/>
+        <w:ind w:left="567" w:hanging="567"/>
       </w:pPr>
       <w:r>
         <w:rPr>
-          <w:b w:val="0"/>
-        </w:rPr>
-        <w:t xml:space="preserve">Detrano, R. et al. (1989). International application of a new probability algorithm for the diagnosis of coronary artery disease. </w:t>
+          <w:sz w:val="20"/>
+        </w:rPr>
+        <w:t xml:space="preserve">14. </w:t>
+      </w:r>
+      <w:r>
+        <w:rPr>
+          <w:b w:val="0"/>
+        </w:rPr>
+        <w:t xml:space="preserve">Maehara, K. &amp; Ohkawa, Y. (2025). Geometry-preserving vector field reconstruction of high-dimensional cell-state dynamics using ddHodge. </w:t>
       </w:r>
       <w:r>
         <w:rPr>
           <w:b w:val="0"/>
           <w:i/>
         </w:rPr>
-        <w:t>American Journal of Cardiology</w:t>
-      </w:r>
-      <w:r>
-        <w:rPr>
-          <w:b w:val="0"/>
-        </w:rPr>
-        <w:t>, 64, 304–310.</w:t>
+        <w:t>Nature Communications</w:t>
+      </w:r>
+      <w:r>
+        <w:rPr>
+          <w:b w:val="0"/>
+        </w:rPr>
+        <w:t>, 16, 11342.</w:t>
       </w:r>
     </w:p>
     <w:p>
       <w:pPr>
-        <w:pStyle w:val="ListNumber"/>
+        <w:ind w:left="567" w:hanging="567"/>
       </w:pPr>
       <w:r>
         <w:rPr>
-          <w:b w:val="0"/>
-        </w:rPr>
-        <w:t xml:space="preserve">Rubin, D.B. (1974). Estimating causal effects of treatments in randomized and nonrandomized studies. </w:t>
+          <w:sz w:val="20"/>
+        </w:rPr>
+        <w:t xml:space="preserve">15. </w:t>
+      </w:r>
+      <w:r>
+        <w:rPr>
+          <w:b w:val="0"/>
+        </w:rPr>
+        <w:t xml:space="preserve">Seifert, B., Wendler, C. &amp; Püschel, M. (2023). Causal Fourier analysis on directed acyclic graphs and posets. </w:t>
       </w:r>
       <w:r>
         <w:rPr>
           <w:b w:val="0"/>
           <w:i/>
         </w:rPr>
-        <w:t>Journal of Educational Psychology</w:t>
-      </w:r>
-      <w:r>
-        <w:rPr>
-          <w:b w:val="0"/>
-        </w:rPr>
-        <w:t>, 66(5), 688–701.</w:t>
+        <w:t>IEEE Transactions on Signal Processing</w:t>
+      </w:r>
+      <w:r>
+        <w:rPr>
+          <w:b w:val="0"/>
+        </w:rPr>
+        <w:t>, 71, 3516–3530.</w:t>
       </w:r>
     </w:p>
     <w:p>
       <w:pPr>
-        <w:pStyle w:val="ListNumber"/>
+        <w:ind w:left="567" w:hanging="567"/>
       </w:pPr>
       <w:r>
         <w:rPr>
-          <w:b w:val="0"/>
-        </w:rPr>
-        <w:t xml:space="preserve">Fanuel, M. &amp; Suykens, J.A.K. (2017a). Deformed Laplacians and spectral ranking in directed networks. </w:t>
+          <w:sz w:val="20"/>
+        </w:rPr>
+        <w:t xml:space="preserve">16. </w:t>
+      </w:r>
+      <w:r>
+        <w:rPr>
+          <w:b w:val="0"/>
+        </w:rPr>
+        <w:t xml:space="preserve">Misiakos, P., Mihal, V. &amp; Püschel, M. (2024). Learning signals and graphs from time-series graph data with few causes. In </w:t>
       </w:r>
       <w:r>
         <w:rPr>
           <w:b w:val="0"/>
           <w:i/>
         </w:rPr>
-        <w:t>arXiv:1511.00492</w:t>
+        <w:t>IEEE ICASSP 2024</w:t>
       </w:r>
       <w:r>
         <w:rPr>
@@ -22718,338 +22814,422 @@
     </w:p>
     <w:p>
       <w:pPr>
-        <w:pStyle w:val="ListNumber"/>
+        <w:ind w:left="567" w:hanging="567"/>
       </w:pPr>
       <w:r>
         <w:rPr>
-          <w:b w:val="0"/>
-        </w:rPr>
-        <w:t xml:space="preserve">Fanuel, M., Alaíz, C.M. &amp; Suykens, J.A.K. (2017b). Magnetic eigenmaps for community detection in directed networks. </w:t>
+          <w:sz w:val="20"/>
+        </w:rPr>
+        <w:t xml:space="preserve">17. </w:t>
+      </w:r>
+      <w:r>
+        <w:rPr>
+          <w:b w:val="0"/>
+        </w:rPr>
+        <w:t xml:space="preserve">Stanković, L. et al. (2024). Fourier analysis of signals on directed acyclic graphs (DAG) using graph zero-padding. </w:t>
       </w:r>
       <w:r>
         <w:rPr>
           <w:b w:val="0"/>
           <w:i/>
         </w:rPr>
-        <w:t>Physical Review E</w:t>
-      </w:r>
-      <w:r>
-        <w:rPr>
-          <w:b w:val="0"/>
-        </w:rPr>
-        <w:t>, 95, 022302.</w:t>
+        <w:t>arXiv:2311.01073</w:t>
+      </w:r>
+      <w:r>
+        <w:rPr>
+          <w:b w:val="0"/>
+        </w:rPr>
+        <w:t>.</w:t>
       </w:r>
     </w:p>
     <w:p>
       <w:pPr>
-        <w:pStyle w:val="ListNumber"/>
+        <w:ind w:left="567" w:hanging="567"/>
       </w:pPr>
       <w:r>
         <w:rPr>
-          <w:b w:val="0"/>
-        </w:rPr>
-        <w:t xml:space="preserve">Maehara, K. &amp; Ohkawa, Y. (2025). Geometry-preserving vector field reconstruction of high-dimensional cell-state dynamics using ddHodge. </w:t>
+          <w:sz w:val="20"/>
+        </w:rPr>
+        <w:t xml:space="preserve">18. </w:t>
+      </w:r>
+      <w:r>
+        <w:rPr>
+          <w:b w:val="0"/>
+        </w:rPr>
+        <w:t xml:space="preserve">Zheng, X., Aragam, B., Ravikumar, P. &amp; Xing, E.P. (2018). DAGs with NO TEARS: Continuous optimization for structure learning. In </w:t>
       </w:r>
       <w:r>
         <w:rPr>
           <w:b w:val="0"/>
           <w:i/>
         </w:rPr>
-        <w:t>Nature Communications</w:t>
-      </w:r>
-      <w:r>
-        <w:rPr>
-          <w:b w:val="0"/>
-        </w:rPr>
-        <w:t>, 16, 11342.</w:t>
+        <w:t>Advances in Neural Information Processing Systems</w:t>
+      </w:r>
+      <w:r>
+        <w:rPr>
+          <w:b w:val="0"/>
+        </w:rPr>
+        <w:t xml:space="preserve"> (NeurIPS 2018).</w:t>
       </w:r>
     </w:p>
     <w:p>
       <w:pPr>
-        <w:pStyle w:val="ListNumber"/>
+        <w:ind w:left="567" w:hanging="567"/>
       </w:pPr>
       <w:r>
         <w:rPr>
-          <w:b w:val="0"/>
-        </w:rPr>
-        <w:t xml:space="preserve">Misiakos, P., Mihal, V. &amp; Püschel, M. (2024). Learning signals and graphs from time-series graph data with few causes. In </w:t>
+          <w:sz w:val="20"/>
+        </w:rPr>
+        <w:t xml:space="preserve">19. </w:t>
+      </w:r>
+      <w:r>
+        <w:rPr>
+          <w:b w:val="0"/>
+        </w:rPr>
+        <w:t xml:space="preserve">Ng, I., Ghassami, A. &amp; Zhang, K. (2020). On the role of sparsity and DAG constraints for learning linear DAGs. In </w:t>
       </w:r>
       <w:r>
         <w:rPr>
           <w:b w:val="0"/>
           <w:i/>
         </w:rPr>
-        <w:t>IEEE ICASSP 2024</w:t>
-      </w:r>
-      <w:r>
-        <w:rPr>
-          <w:b w:val="0"/>
-        </w:rPr>
-        <w:t>.</w:t>
+        <w:t>Advances in Neural Information Processing Systems</w:t>
+      </w:r>
+      <w:r>
+        <w:rPr>
+          <w:b w:val="0"/>
+        </w:rPr>
+        <w:t xml:space="preserve"> (NeurIPS 2020).</w:t>
       </w:r>
     </w:p>
     <w:p>
       <w:pPr>
-        <w:pStyle w:val="ListNumber"/>
+        <w:ind w:left="567" w:hanging="567"/>
       </w:pPr>
       <w:r>
         <w:rPr>
-          <w:b w:val="0"/>
-        </w:rPr>
-        <w:t xml:space="preserve">Stanković, L. et al. (2024). Fourier analysis of signals on directed acyclic graphs (DAG) using graph zero-padding. </w:t>
+          <w:sz w:val="20"/>
+        </w:rPr>
+        <w:t xml:space="preserve">20. </w:t>
+      </w:r>
+      <w:r>
+        <w:rPr>
+          <w:b w:val="0"/>
+        </w:rPr>
+        <w:t xml:space="preserve">M'Charrak, A., Lukasiewicz, T., Bronstein, M., Reddy, A.G. &amp; Muandet, K. (2025). Connected causal graphs for real-world science. In </w:t>
       </w:r>
       <w:r>
         <w:rPr>
           <w:b w:val="0"/>
           <w:i/>
         </w:rPr>
-        <w:t>arXiv:2311.01073</w:t>
-      </w:r>
-      <w:r>
-        <w:rPr>
-          <w:b w:val="0"/>
-        </w:rPr>
-        <w:t>.</w:t>
+        <w:t>International Conference on Learning Representations</w:t>
+      </w:r>
+      <w:r>
+        <w:rPr>
+          <w:b w:val="0"/>
+        </w:rPr>
+        <w:t xml:space="preserve"> (ICLR 2025).</w:t>
       </w:r>
     </w:p>
     <w:p>
       <w:pPr>
-        <w:pStyle w:val="ListNumber"/>
+        <w:ind w:left="567" w:hanging="567"/>
       </w:pPr>
       <w:r>
         <w:rPr>
-          <w:b w:val="0"/>
-        </w:rPr>
-        <w:t xml:space="preserve">Zheng, X., Aragam, B., Ravikumar, P. &amp; Xing, E.P. (2018). DAGs with NO TEARS: Continuous optimization for structure learning. In </w:t>
+          <w:sz w:val="20"/>
+        </w:rPr>
+        <w:t xml:space="preserve">21. </w:t>
+      </w:r>
+      <w:r>
+        <w:rPr>
+          <w:b w:val="0"/>
+        </w:rPr>
+        <w:t xml:space="preserve">Schreiber, T. (2000). Measuring information transfer. </w:t>
       </w:r>
       <w:r>
         <w:rPr>
           <w:b w:val="0"/>
           <w:i/>
         </w:rPr>
-        <w:t>Advances in Neural Information Processing Systems</w:t>
-      </w:r>
-      <w:r>
-        <w:rPr>
-          <w:b w:val="0"/>
-        </w:rPr>
-        <w:t xml:space="preserve"> (NeurIPS 2018).</w:t>
+        <w:t>Physical Review Letters</w:t>
+      </w:r>
+      <w:r>
+        <w:rPr>
+          <w:b w:val="0"/>
+        </w:rPr>
+        <w:t>, 85(2), 461–464.</w:t>
       </w:r>
     </w:p>
     <w:p>
       <w:pPr>
-        <w:pStyle w:val="ListNumber"/>
+        <w:ind w:left="567" w:hanging="567"/>
       </w:pPr>
       <w:r>
         <w:rPr>
-          <w:b w:val="0"/>
-        </w:rPr>
-        <w:t xml:space="preserve">Ng, I., Ghassami, A. &amp; Zhang, K. (2020). On the role of sparsity and DAG constraints for learning linear DAGs. In </w:t>
+          <w:sz w:val="20"/>
+        </w:rPr>
+        <w:t xml:space="preserve">22. </w:t>
+      </w:r>
+      <w:r>
+        <w:rPr>
+          <w:b w:val="0"/>
+        </w:rPr>
+        <w:t xml:space="preserve">Sugihara, G. et al. (2012). Detecting causality in complex ecosystems. </w:t>
       </w:r>
       <w:r>
         <w:rPr>
           <w:b w:val="0"/>
           <w:i/>
         </w:rPr>
-        <w:t>Advances in Neural Information Processing Systems</w:t>
-      </w:r>
-      <w:r>
-        <w:rPr>
-          <w:b w:val="0"/>
-        </w:rPr>
-        <w:t xml:space="preserve"> (NeurIPS 2020).</w:t>
+        <w:t>Science</w:t>
+      </w:r>
+      <w:r>
+        <w:rPr>
+          <w:b w:val="0"/>
+        </w:rPr>
+        <w:t>, 338, 496–500.</w:t>
       </w:r>
     </w:p>
     <w:p>
       <w:pPr>
-        <w:pStyle w:val="ListNumber"/>
+        <w:ind w:left="567" w:hanging="567"/>
       </w:pPr>
       <w:r>
         <w:rPr>
-          <w:b w:val="0"/>
-        </w:rPr>
-        <w:t xml:space="preserve">M'Charrak, A., Lukasiewicz, T., Bronstein, M., Reddy, A.G. &amp; Muandet, K. (2025). Connected causal graphs for real-world science. In </w:t>
+          <w:sz w:val="20"/>
+        </w:rPr>
+        <w:t xml:space="preserve">23. </w:t>
+      </w:r>
+      <w:r>
+        <w:rPr>
+          <w:b w:val="0"/>
+        </w:rPr>
+        <w:t xml:space="preserve">Kotoku, J. et al. (2020). Causal relations of health indices inferred statistically using the DirectLiNGAM algorithm from a cross-sectional study. </w:t>
       </w:r>
       <w:r>
         <w:rPr>
           <w:b w:val="0"/>
           <w:i/>
         </w:rPr>
-        <w:t>International Conference on Learning Representations</w:t>
-      </w:r>
-      <w:r>
-        <w:rPr>
-          <w:b w:val="0"/>
-        </w:rPr>
-        <w:t xml:space="preserve"> (ICLR 2025).</w:t>
+        <w:t>PLOS ONE</w:t>
+      </w:r>
+      <w:r>
+        <w:rPr>
+          <w:b w:val="0"/>
+        </w:rPr>
+        <w:t>, 15(12), e0243229.</w:t>
       </w:r>
     </w:p>
     <w:p>
       <w:pPr>
-        <w:pStyle w:val="ListNumber"/>
+        <w:ind w:left="567" w:hanging="567"/>
       </w:pPr>
       <w:r>
         <w:rPr>
-          <w:b w:val="0"/>
-        </w:rPr>
-        <w:t xml:space="preserve">Schreiber, T. (2000). Measuring information transfer. </w:t>
+          <w:sz w:val="20"/>
+        </w:rPr>
+        <w:t xml:space="preserve">24. </w:t>
+      </w:r>
+      <w:r>
+        <w:rPr>
+          <w:b w:val="0"/>
+        </w:rPr>
+        <w:t xml:space="preserve">Okuda, S. et al. (2025). Operationalizing longitudinal causal discovery under real-world workflow constraints. </w:t>
       </w:r>
       <w:r>
         <w:rPr>
           <w:b w:val="0"/>
           <w:i/>
         </w:rPr>
-        <w:t>Physical Review Letters</w:t>
-      </w:r>
-      <w:r>
-        <w:rPr>
-          <w:b w:val="0"/>
-        </w:rPr>
-        <w:t>, 85(2), 461–464.</w:t>
+        <w:t>arXiv:2602.23800</w:t>
+      </w:r>
+      <w:r>
+        <w:rPr>
+          <w:b w:val="0"/>
+        </w:rPr>
+        <w:t>.</w:t>
       </w:r>
     </w:p>
     <w:p>
       <w:pPr>
-        <w:pStyle w:val="ListNumber"/>
+        <w:ind w:left="567" w:hanging="567"/>
       </w:pPr>
       <w:r>
         <w:rPr>
-          <w:b w:val="0"/>
-        </w:rPr>
-        <w:t xml:space="preserve">Sugihara, G. et al. (2012). Detecting causality in complex ecosystems. </w:t>
+          <w:sz w:val="20"/>
+        </w:rPr>
+        <w:t xml:space="preserve">25. </w:t>
+      </w:r>
+      <w:r>
+        <w:rPr>
+          <w:b w:val="0"/>
+        </w:rPr>
+        <w:t xml:space="preserve">Le, H.D., Xia, X. &amp; Chen, Z. (2024). Multi-agent causal discovery using large language models. </w:t>
       </w:r>
       <w:r>
         <w:rPr>
           <w:b w:val="0"/>
           <w:i/>
         </w:rPr>
-        <w:t>Science</w:t>
-      </w:r>
-      <w:r>
-        <w:rPr>
-          <w:b w:val="0"/>
-        </w:rPr>
-        <w:t>, 338, 496–500.</w:t>
+        <w:t>arXiv:2407.15073</w:t>
+      </w:r>
+      <w:r>
+        <w:rPr>
+          <w:b w:val="0"/>
+        </w:rPr>
+        <w:t>.</w:t>
       </w:r>
     </w:p>
     <w:p>
       <w:pPr>
-        <w:pStyle w:val="ListNumber"/>
+        <w:ind w:left="567" w:hanging="567"/>
       </w:pPr>
       <w:r>
         <w:rPr>
-          <w:b w:val="0"/>
-        </w:rPr>
-        <w:t xml:space="preserve">Le, H.D., Xia, X. &amp; Chen, Z. (2024). Multi-agent causal discovery using large language models. </w:t>
+          <w:sz w:val="20"/>
+        </w:rPr>
+        <w:t xml:space="preserve">26. </w:t>
+      </w:r>
+      <w:r>
+        <w:rPr>
+          <w:b w:val="0"/>
+        </w:rPr>
+        <w:t xml:space="preserve">Sheth, I., Fatemi, B. &amp; Fritz, M. (2025). CausalGraph2LLM: Evaluating LLMs for causal queries. In </w:t>
       </w:r>
       <w:r>
         <w:rPr>
           <w:b w:val="0"/>
           <w:i/>
         </w:rPr>
-        <w:t>arXiv:2407.15073</w:t>
-      </w:r>
-      <w:r>
-        <w:rPr>
-          <w:b w:val="0"/>
-        </w:rPr>
-        <w:t>.</w:t>
+        <w:t>Findings of NAACL 2025</w:t>
+      </w:r>
+      <w:r>
+        <w:rPr>
+          <w:b w:val="0"/>
+        </w:rPr>
+        <w:t>, 2076–2098.</w:t>
       </w:r>
     </w:p>
     <w:p>
       <w:pPr>
-        <w:pStyle w:val="ListNumber"/>
+        <w:ind w:left="567" w:hanging="567"/>
       </w:pPr>
       <w:r>
         <w:rPr>
-          <w:b w:val="0"/>
-        </w:rPr>
-        <w:t xml:space="preserve">Sheth, I., Fatemi, B. &amp; Fritz, M. (2025). CausalGraph2LLM: Evaluating LLMs for causal queries. In </w:t>
+          <w:sz w:val="20"/>
+        </w:rPr>
+        <w:t xml:space="preserve">27. </w:t>
+      </w:r>
+      <w:r>
+        <w:rPr>
+          <w:b w:val="0"/>
+        </w:rPr>
+        <w:t xml:space="preserve">Wein, S. et al. (2021). A graph neural network framework for causal inference in brain networks. </w:t>
       </w:r>
       <w:r>
         <w:rPr>
           <w:b w:val="0"/>
           <w:i/>
         </w:rPr>
-        <w:t>Findings of NAACL 2025</w:t>
-      </w:r>
-      <w:r>
-        <w:rPr>
-          <w:b w:val="0"/>
-        </w:rPr>
-        <w:t>, 2076–2098.</w:t>
+        <w:t>Scientific Reports</w:t>
+      </w:r>
+      <w:r>
+        <w:rPr>
+          <w:b w:val="0"/>
+        </w:rPr>
+        <w:t>, 11, 8061.</w:t>
       </w:r>
     </w:p>
     <w:p>
       <w:pPr>
-        <w:pStyle w:val="ListNumber"/>
+        <w:ind w:left="567" w:hanging="567"/>
       </w:pPr>
       <w:r>
         <w:rPr>
-          <w:b w:val="0"/>
-        </w:rPr>
-        <w:t xml:space="preserve">Wein, S. et al. (2021). A graph neural network framework for causal inference in brain networks. </w:t>
+          <w:sz w:val="20"/>
+        </w:rPr>
+        <w:t xml:space="preserve">28. </w:t>
+      </w:r>
+      <w:r>
+        <w:rPr>
+          <w:b w:val="0"/>
+        </w:rPr>
+        <w:t xml:space="preserve">Bernal-González, S. et al. (2025). Directed graph theory for the analysis of biological regulatory networks. </w:t>
       </w:r>
       <w:r>
         <w:rPr>
           <w:b w:val="0"/>
           <w:i/>
         </w:rPr>
-        <w:t>Scientific Reports</w:t>
-      </w:r>
-      <w:r>
-        <w:rPr>
-          <w:b w:val="0"/>
-        </w:rPr>
-        <w:t>, 11, 8061.</w:t>
+        <w:t>Frontiers in Applied Mathematics and Statistics</w:t>
+      </w:r>
+      <w:r>
+        <w:rPr>
+          <w:b w:val="0"/>
+        </w:rPr>
+        <w:t>, 11, 1644869.</w:t>
       </w:r>
     </w:p>
     <w:p>
       <w:pPr>
-        <w:pStyle w:val="ListNumber"/>
+        <w:ind w:left="567" w:hanging="567"/>
       </w:pPr>
       <w:r>
         <w:rPr>
-          <w:b w:val="0"/>
-        </w:rPr>
-        <w:t xml:space="preserve">Bernal-González, S. et al. (2025). Directed graph theory for the analysis of biological regulatory networks. </w:t>
+          <w:sz w:val="20"/>
+        </w:rPr>
+        <w:t xml:space="preserve">29. </w:t>
+      </w:r>
+      <w:r>
+        <w:rPr>
+          <w:b w:val="0"/>
+        </w:rPr>
+        <w:t xml:space="preserve">Liu, Z. et al. (2026). Causal discovery in observational medical research: Scoping review. </w:t>
       </w:r>
       <w:r>
         <w:rPr>
           <w:b w:val="0"/>
           <w:i/>
         </w:rPr>
-        <w:t>Frontiers in Applied Mathematics and Statistics</w:t>
-      </w:r>
-      <w:r>
-        <w:rPr>
-          <w:b w:val="0"/>
-        </w:rPr>
-        <w:t>, 11, 1644869.</w:t>
+        <w:t>JMIR Medical Informatics</w:t>
+      </w:r>
+      <w:r>
+        <w:rPr>
+          <w:b w:val="0"/>
+        </w:rPr>
+        <w:t>, 14, e82499.</w:t>
       </w:r>
     </w:p>
     <w:p>
       <w:pPr>
-        <w:pStyle w:val="ListNumber"/>
+        <w:ind w:left="567" w:hanging="567"/>
       </w:pPr>
       <w:r>
         <w:rPr>
-          <w:b w:val="0"/>
-        </w:rPr>
-        <w:t xml:space="preserve">Liu, Z. et al. (2026). Causal discovery in observational medical research: Scoping review. </w:t>
+          <w:sz w:val="20"/>
+        </w:rPr>
+        <w:t xml:space="preserve">30. </w:t>
+      </w:r>
+      <w:r>
+        <w:rPr>
+          <w:b w:val="0"/>
+        </w:rPr>
+        <w:t xml:space="preserve">Detrano, R. et al. (1989). International application of a new probability algorithm for the diagnosis of coronary artery disease. </w:t>
       </w:r>
       <w:r>
         <w:rPr>
           <w:b w:val="0"/>
           <w:i/>
         </w:rPr>
-        <w:t>JMIR Medical Informatics</w:t>
-      </w:r>
-      <w:r>
-        <w:rPr>
-          <w:b w:val="0"/>
-        </w:rPr>
-        <w:t>, 14, e82499.</w:t>
+        <w:t>American Journal of Cardiology</w:t>
+      </w:r>
+      <w:r>
+        <w:rPr>
+          <w:b w:val="0"/>
+        </w:rPr>
+        <w:t>, 64, 304–310.</w:t>
       </w:r>
     </w:p>
     <w:sectPr>

</xml_diff>